<commit_message>
fin du document 2
</commit_message>
<xml_diff>
--- a/Labo4_Exercices_2.docx
+++ b/Labo4_Exercices_2.docx
@@ -1,10 +1,10 @@
 
 <file path=word/document.xml><?xml version="1.0" encoding="utf-8"?>
-<w:document xmlns:wpc="http://schemas.microsoft.com/office/word/2010/wordprocessingCanvas" xmlns:mc="http://schemas.openxmlformats.org/markup-compatibility/2006" xmlns:o="urn:schemas-microsoft-com:office:office" xmlns:r="http://schemas.openxmlformats.org/officeDocument/2006/relationships" xmlns:m="http://schemas.openxmlformats.org/officeDocument/2006/math" xmlns:v="urn:schemas-microsoft-com:vml" xmlns:wp14="http://schemas.microsoft.com/office/word/2010/wordprocessingDrawing" xmlns:wp="http://schemas.openxmlformats.org/drawingml/2006/wordprocessingDrawing" xmlns:w10="urn:schemas-microsoft-com:office:word" xmlns:w="http://schemas.openxmlformats.org/wordprocessingml/2006/main" xmlns:w14="http://schemas.microsoft.com/office/word/2010/wordml" xmlns:w15="http://schemas.microsoft.com/office/word/2012/wordml" xmlns:wpg="http://schemas.microsoft.com/office/word/2010/wordprocessingGroup" xmlns:wpi="http://schemas.microsoft.com/office/word/2010/wordprocessingInk" xmlns:wne="http://schemas.microsoft.com/office/word/2006/wordml" xmlns:wps="http://schemas.microsoft.com/office/word/2010/wordprocessingShape" mc:Ignorable="w14 w15 wp14">
+<w:document xmlns:wpc="http://schemas.microsoft.com/office/word/2010/wordprocessingCanvas" xmlns:cx="http://schemas.microsoft.com/office/drawing/2014/chartex" xmlns:cx1="http://schemas.microsoft.com/office/drawing/2015/9/8/chartex" xmlns:cx2="http://schemas.microsoft.com/office/drawing/2015/10/21/chartex" xmlns:cx3="http://schemas.microsoft.com/office/drawing/2016/5/9/chartex" xmlns:cx4="http://schemas.microsoft.com/office/drawing/2016/5/10/chartex" xmlns:cx5="http://schemas.microsoft.com/office/drawing/2016/5/11/chartex" xmlns:cx6="http://schemas.microsoft.com/office/drawing/2016/5/12/chartex" xmlns:cx7="http://schemas.microsoft.com/office/drawing/2016/5/13/chartex" xmlns:cx8="http://schemas.microsoft.com/office/drawing/2016/5/14/chartex" xmlns:mc="http://schemas.openxmlformats.org/markup-compatibility/2006" xmlns:aink="http://schemas.microsoft.com/office/drawing/2016/ink" xmlns:am3d="http://schemas.microsoft.com/office/drawing/2017/model3d" xmlns:o="urn:schemas-microsoft-com:office:office" xmlns:oel="http://schemas.microsoft.com/office/2019/extlst" xmlns:r="http://schemas.openxmlformats.org/officeDocument/2006/relationships" xmlns:m="http://schemas.openxmlformats.org/officeDocument/2006/math" xmlns:v="urn:schemas-microsoft-com:vml" xmlns:wp14="http://schemas.microsoft.com/office/word/2010/wordprocessingDrawing" xmlns:wp="http://schemas.openxmlformats.org/drawingml/2006/wordprocessingDrawing" xmlns:w10="urn:schemas-microsoft-com:office:word" xmlns:w="http://schemas.openxmlformats.org/wordprocessingml/2006/main" xmlns:w14="http://schemas.microsoft.com/office/word/2010/wordml" xmlns:w15="http://schemas.microsoft.com/office/word/2012/wordml" xmlns:w16cex="http://schemas.microsoft.com/office/word/2018/wordml/cex" xmlns:w16cid="http://schemas.microsoft.com/office/word/2016/wordml/cid" xmlns:w16="http://schemas.microsoft.com/office/word/2018/wordml" xmlns:w16du="http://schemas.microsoft.com/office/word/2023/wordml/word16du" xmlns:w16sdtdh="http://schemas.microsoft.com/office/word/2020/wordml/sdtdatahash" xmlns:w16sdtfl="http://schemas.microsoft.com/office/word/2024/wordml/sdtformatlock" xmlns:w16se="http://schemas.microsoft.com/office/word/2015/wordml/symex" xmlns:wpg="http://schemas.microsoft.com/office/word/2010/wordprocessingGroup" xmlns:wpi="http://schemas.microsoft.com/office/word/2010/wordprocessingInk" xmlns:wne="http://schemas.microsoft.com/office/word/2006/wordml" xmlns:wps="http://schemas.microsoft.com/office/word/2010/wordprocessingShape" mc:Ignorable="w14 w15 w16se w16cid w16 w16cex w16sdtdh w16sdtfl w16du wp14">
   <w:body>
     <w:p>
       <w:pPr>
-        <w:pStyle w:val="Titre"/>
+        <w:pStyle w:val="Title"/>
       </w:pPr>
       <w:r>
         <w:t>GEIN3010 Exercices avancés</w:t>
@@ -12,7 +12,7 @@
     </w:p>
     <w:p>
       <w:pPr>
-        <w:pStyle w:val="Titre1"/>
+        <w:pStyle w:val="Heading1"/>
       </w:pPr>
       <w:r>
         <w:t>Exercice 1</w:t>
@@ -46,7 +46,7 @@
     </w:p>
     <w:p>
       <w:pPr>
-        <w:pStyle w:val="Sous-titre"/>
+        <w:pStyle w:val="Subtitle"/>
       </w:pPr>
       <w:r>
         <w:t>Calculez :</w:t>
@@ -54,7 +54,7 @@
     </w:p>
     <w:p>
       <w:pPr>
-        <w:pStyle w:val="Paragraphedeliste"/>
+        <w:pStyle w:val="ListParagraph"/>
         <w:numPr>
           <w:ilvl w:val="0"/>
           <w:numId w:val="1"/>
@@ -81,10 +81,22 @@
       <w:r>
         <w:t>canal qui permettra de transmettre l’information.</w:t>
       </w:r>
-    </w:p>
-    <w:p>
-      <w:pPr>
-        <w:pStyle w:val="Paragraphedeliste"/>
+      <w:r>
+        <w:t xml:space="preserve"> : </w:t>
+      </w:r>
+      <w:r>
+        <w:t>72.25</w:t>
+      </w:r>
+      <w:r>
+        <w:t xml:space="preserve"> </w:t>
+      </w:r>
+      <w:r>
+        <w:t>dB</w:t>
+      </w:r>
+    </w:p>
+    <w:p>
+      <w:pPr>
+        <w:pStyle w:val="ListParagraph"/>
         <w:numPr>
           <w:ilvl w:val="0"/>
           <w:numId w:val="1"/>
@@ -123,10 +135,25 @@
       <w:r>
         <w:t>pouvoir transmettre l’information?</w:t>
       </w:r>
-    </w:p>
-    <w:p>
-      <w:pPr>
-        <w:pStyle w:val="Paragraphedeliste"/>
+      <w:r>
+        <w:t> :</w:t>
+      </w:r>
+      <w:r>
+        <w:t xml:space="preserve"> </w:t>
+      </w:r>
+      <w:r>
+        <w:t xml:space="preserve">réduit de </w:t>
+      </w:r>
+      <w:r>
+        <w:t>4</w:t>
+      </w:r>
+      <w:r>
+        <w:t>KHz</w:t>
+      </w:r>
+    </w:p>
+    <w:p>
+      <w:pPr>
+        <w:pStyle w:val="ListParagraph"/>
         <w:numPr>
           <w:ilvl w:val="0"/>
           <w:numId w:val="1"/>
@@ -135,10 +162,13 @@
       <w:r>
         <w:t>On désire maintenant enregistrer 24heures de données, combien d’espace sera nécessaire pour le stockage (utilisez l’échelle appropriée) ?</w:t>
       </w:r>
-    </w:p>
-    <w:p>
-      <w:pPr>
-        <w:pStyle w:val="Paragraphedeliste"/>
+      <w:r>
+        <w:t xml:space="preserve"> </w:t>
+      </w:r>
+    </w:p>
+    <w:p>
+      <w:pPr>
+        <w:pStyle w:val="ListParagraph"/>
         <w:numPr>
           <w:ilvl w:val="1"/>
           <w:numId w:val="1"/>
@@ -147,27 +177,31 @@
       <w:r>
         <w:t>Convertissez maintenant cette quantité en kb</w:t>
       </w:r>
-    </w:p>
-    <w:p>
-      <w:pPr>
-        <w:pStyle w:val="Paragraphedeliste"/>
+      <w:r>
+        <w:t> : 41472 kb</w:t>
+      </w:r>
+    </w:p>
+    <w:p>
+      <w:pPr>
+        <w:pStyle w:val="ListParagraph"/>
         <w:numPr>
           <w:ilvl w:val="1"/>
           <w:numId w:val="1"/>
         </w:numPr>
       </w:pPr>
       <w:r>
-        <w:t xml:space="preserve">Convertissez maintenant cette quantité en </w:t>
-      </w:r>
-      <w:proofErr w:type="spellStart"/>
-      <w:r>
-        <w:t>Tio</w:t>
-      </w:r>
-      <w:proofErr w:type="spellEnd"/>
-    </w:p>
-    <w:p>
-      <w:pPr>
-        <w:pStyle w:val="Paragraphedeliste"/>
+        <w:t>Convertissez maintenant cette quantité en Tio</w:t>
+      </w:r>
+      <w:r>
+        <w:t xml:space="preserve"> : </w:t>
+      </w:r>
+      <w:r>
+        <w:t>0.00000471 Tio</w:t>
+      </w:r>
+    </w:p>
+    <w:p>
+      <w:pPr>
+        <w:pStyle w:val="ListParagraph"/>
         <w:numPr>
           <w:ilvl w:val="1"/>
           <w:numId w:val="1"/>
@@ -176,10 +210,16 @@
       <w:r>
         <w:t>Convertissez maintenant cette quantité en Mo</w:t>
       </w:r>
-    </w:p>
-    <w:p>
-      <w:pPr>
-        <w:pStyle w:val="Paragraphedeliste"/>
+      <w:r>
+        <w:t xml:space="preserve"> : </w:t>
+      </w:r>
+      <w:r>
+        <w:t>5.184 Mo</w:t>
+      </w:r>
+    </w:p>
+    <w:p>
+      <w:pPr>
+        <w:pStyle w:val="ListParagraph"/>
         <w:numPr>
           <w:ilvl w:val="0"/>
           <w:numId w:val="1"/>
@@ -191,7 +231,7 @@
     </w:p>
     <w:p>
       <w:pPr>
-        <w:pStyle w:val="Paragraphedeliste"/>
+        <w:pStyle w:val="ListParagraph"/>
         <w:numPr>
           <w:ilvl w:val="1"/>
           <w:numId w:val="1"/>
@@ -200,10 +240,13 @@
       <w:r>
         <w:t>Le nouveau débit</w:t>
       </w:r>
-    </w:p>
-    <w:p>
-      <w:pPr>
-        <w:pStyle w:val="Paragraphedeliste"/>
+      <w:r>
+        <w:t> : 288 bits/s</w:t>
+      </w:r>
+    </w:p>
+    <w:p>
+      <w:pPr>
+        <w:pStyle w:val="ListParagraph"/>
         <w:numPr>
           <w:ilvl w:val="1"/>
           <w:numId w:val="1"/>
@@ -230,10 +273,16 @@
       <w:r>
         <w:t>canal qui permettra de transmettre l’information.</w:t>
       </w:r>
-    </w:p>
-    <w:p>
-      <w:pPr>
-        <w:pStyle w:val="Paragraphedeliste"/>
+      <w:r>
+        <w:t> : 43.35</w:t>
+      </w:r>
+      <w:r>
+        <w:t xml:space="preserve"> dB</w:t>
+      </w:r>
+    </w:p>
+    <w:p>
+      <w:pPr>
+        <w:pStyle w:val="ListParagraph"/>
         <w:numPr>
           <w:ilvl w:val="1"/>
           <w:numId w:val="1"/>
@@ -252,36 +301,30 @@
         <w:t xml:space="preserve"> </w:t>
       </w:r>
       <w:r>
-        <w:t>de 90.3dB, de combien doit-on augmenter</w:t>
-      </w:r>
-      <w:r>
-        <w:t>, ou réduire,</w:t>
-      </w:r>
-      <w:r>
-        <w:t xml:space="preserve"> la bande passante pour pouvoir transmettre l’information?</w:t>
-      </w:r>
-    </w:p>
-    <w:p>
-      <w:pPr>
-        <w:pStyle w:val="Paragraphedeliste"/>
+        <w:t>de 90.3dB, de combien doit-on augmenter, ou réduire, la bande passante pour pouvoir transmettre l’information?</w:t>
+      </w:r>
+      <w:r>
+        <w:t xml:space="preserve"> : </w:t>
+      </w:r>
+      <w:r>
+        <w:t>réduire de 10.4 kHz</w:t>
+      </w:r>
+    </w:p>
+    <w:p>
+      <w:pPr>
+        <w:pStyle w:val="ListParagraph"/>
         <w:numPr>
           <w:ilvl w:val="1"/>
           <w:numId w:val="1"/>
         </w:numPr>
       </w:pPr>
       <w:r>
-        <w:t xml:space="preserve">On désire maintenant enregistrer </w:t>
-      </w:r>
-      <w:r>
-        <w:t>16heures</w:t>
-      </w:r>
-      <w:r>
-        <w:t xml:space="preserve"> de données, combien d’espace sera nécessaire pour le stockage (utilisez l’échelle appropriée) ?</w:t>
-      </w:r>
-    </w:p>
-    <w:p>
-      <w:pPr>
-        <w:pStyle w:val="Paragraphedeliste"/>
+        <w:t>On désire maintenant enregistrer 16heures de données, combien d’espace sera nécessaire pour le stockage (utilisez l’échelle appropriée) ?</w:t>
+      </w:r>
+    </w:p>
+    <w:p>
+      <w:pPr>
+        <w:pStyle w:val="ListParagraph"/>
         <w:numPr>
           <w:ilvl w:val="2"/>
           <w:numId w:val="1"/>
@@ -290,27 +333,28 @@
       <w:r>
         <w:t>Convertissez maintenant cette quantité en kb</w:t>
       </w:r>
-    </w:p>
-    <w:p>
-      <w:pPr>
-        <w:pStyle w:val="Paragraphedeliste"/>
+      <w:r>
+        <w:t> : 16588.8 kb</w:t>
+      </w:r>
+    </w:p>
+    <w:p>
+      <w:pPr>
+        <w:pStyle w:val="ListParagraph"/>
         <w:numPr>
           <w:ilvl w:val="2"/>
           <w:numId w:val="1"/>
         </w:numPr>
       </w:pPr>
       <w:r>
-        <w:t xml:space="preserve">Convertissez maintenant cette quantité en </w:t>
-      </w:r>
-      <w:proofErr w:type="spellStart"/>
-      <w:r>
-        <w:t>Tio</w:t>
-      </w:r>
-      <w:proofErr w:type="spellEnd"/>
-    </w:p>
-    <w:p>
-      <w:pPr>
-        <w:pStyle w:val="Paragraphedeliste"/>
+        <w:t>Convertissez maintenant cette quantité en Tio</w:t>
+      </w:r>
+      <w:r>
+        <w:t> : 0. 00000018859 Tio</w:t>
+      </w:r>
+    </w:p>
+    <w:p>
+      <w:pPr>
+        <w:pStyle w:val="ListParagraph"/>
         <w:numPr>
           <w:ilvl w:val="2"/>
           <w:numId w:val="1"/>
@@ -319,19 +363,25 @@
       <w:r>
         <w:t>Convertissez maintenant cette quantité en Mo</w:t>
       </w:r>
-    </w:p>
-    <w:p>
-      <w:pPr>
-        <w:pStyle w:val="Paragraphedeliste"/>
+      <w:r>
+        <w:t xml:space="preserve"> : </w:t>
+      </w:r>
+      <w:r>
+        <w:t>2.07 Mo</w:t>
+      </w:r>
+      <w:r>
+        <w:t xml:space="preserve"> (L’échelle appropriée)</w:t>
+      </w:r>
+    </w:p>
+    <w:p>
+      <w:pPr>
+        <w:pStyle w:val="ListParagraph"/>
         <w:ind w:left="1440"/>
       </w:pPr>
     </w:p>
     <w:p/>
     <w:p/>
-    <w:p>
-      <w:bookmarkStart w:id="0" w:name="_GoBack"/>
-      <w:bookmarkEnd w:id="0"/>
-    </w:p>
+    <w:p/>
     <w:sectPr>
       <w:footerReference w:type="default" r:id="rId7"/>
       <w:pgSz w:w="12240" w:h="15840"/>
@@ -344,7 +394,7 @@
 </file>
 
 <file path=word/endnotes.xml><?xml version="1.0" encoding="utf-8"?>
-<w:endnotes xmlns:wpc="http://schemas.microsoft.com/office/word/2010/wordprocessingCanvas" xmlns:mc="http://schemas.openxmlformats.org/markup-compatibility/2006" xmlns:o="urn:schemas-microsoft-com:office:office" xmlns:r="http://schemas.openxmlformats.org/officeDocument/2006/relationships" xmlns:m="http://schemas.openxmlformats.org/officeDocument/2006/math" xmlns:v="urn:schemas-microsoft-com:vml" xmlns:wp14="http://schemas.microsoft.com/office/word/2010/wordprocessingDrawing" xmlns:wp="http://schemas.openxmlformats.org/drawingml/2006/wordprocessingDrawing" xmlns:w10="urn:schemas-microsoft-com:office:word" xmlns:w="http://schemas.openxmlformats.org/wordprocessingml/2006/main" xmlns:w14="http://schemas.microsoft.com/office/word/2010/wordml" xmlns:w15="http://schemas.microsoft.com/office/word/2012/wordml" xmlns:wpg="http://schemas.microsoft.com/office/word/2010/wordprocessingGroup" xmlns:wpi="http://schemas.microsoft.com/office/word/2010/wordprocessingInk" xmlns:wne="http://schemas.microsoft.com/office/word/2006/wordml" xmlns:wps="http://schemas.microsoft.com/office/word/2010/wordprocessingShape" mc:Ignorable="w14 w15 wp14">
+<w:endnotes xmlns:wpc="http://schemas.microsoft.com/office/word/2010/wordprocessingCanvas" xmlns:cx="http://schemas.microsoft.com/office/drawing/2014/chartex" xmlns:cx1="http://schemas.microsoft.com/office/drawing/2015/9/8/chartex" xmlns:cx2="http://schemas.microsoft.com/office/drawing/2015/10/21/chartex" xmlns:cx3="http://schemas.microsoft.com/office/drawing/2016/5/9/chartex" xmlns:cx4="http://schemas.microsoft.com/office/drawing/2016/5/10/chartex" xmlns:cx5="http://schemas.microsoft.com/office/drawing/2016/5/11/chartex" xmlns:cx6="http://schemas.microsoft.com/office/drawing/2016/5/12/chartex" xmlns:cx7="http://schemas.microsoft.com/office/drawing/2016/5/13/chartex" xmlns:cx8="http://schemas.microsoft.com/office/drawing/2016/5/14/chartex" xmlns:mc="http://schemas.openxmlformats.org/markup-compatibility/2006" xmlns:aink="http://schemas.microsoft.com/office/drawing/2016/ink" xmlns:am3d="http://schemas.microsoft.com/office/drawing/2017/model3d" xmlns:o="urn:schemas-microsoft-com:office:office" xmlns:oel="http://schemas.microsoft.com/office/2019/extlst" xmlns:r="http://schemas.openxmlformats.org/officeDocument/2006/relationships" xmlns:m="http://schemas.openxmlformats.org/officeDocument/2006/math" xmlns:v="urn:schemas-microsoft-com:vml" xmlns:wp14="http://schemas.microsoft.com/office/word/2010/wordprocessingDrawing" xmlns:wp="http://schemas.openxmlformats.org/drawingml/2006/wordprocessingDrawing" xmlns:w10="urn:schemas-microsoft-com:office:word" xmlns:w="http://schemas.openxmlformats.org/wordprocessingml/2006/main" xmlns:w14="http://schemas.microsoft.com/office/word/2010/wordml" xmlns:w15="http://schemas.microsoft.com/office/word/2012/wordml" xmlns:w16cex="http://schemas.microsoft.com/office/word/2018/wordml/cex" xmlns:w16cid="http://schemas.microsoft.com/office/word/2016/wordml/cid" xmlns:w16="http://schemas.microsoft.com/office/word/2018/wordml" xmlns:w16du="http://schemas.microsoft.com/office/word/2023/wordml/word16du" xmlns:w16sdtdh="http://schemas.microsoft.com/office/word/2020/wordml/sdtdatahash" xmlns:w16sdtfl="http://schemas.microsoft.com/office/word/2024/wordml/sdtformatlock" xmlns:w16se="http://schemas.microsoft.com/office/word/2015/wordml/symex" xmlns:wpg="http://schemas.microsoft.com/office/word/2010/wordprocessingGroup" xmlns:wpi="http://schemas.microsoft.com/office/word/2010/wordprocessingInk" xmlns:wne="http://schemas.microsoft.com/office/word/2006/wordml" xmlns:wps="http://schemas.microsoft.com/office/word/2010/wordprocessingShape" mc:Ignorable="w14 w15 w16se w16cid w16 w16cex w16sdtdh w16sdtfl w16du wp14">
   <w:endnote w:type="separator" w:id="-1">
     <w:p>
       <w:pPr>
@@ -369,10 +419,10 @@
 </file>
 
 <file path=word/footer1.xml><?xml version="1.0" encoding="utf-8"?>
-<w:ftr xmlns:wpc="http://schemas.microsoft.com/office/word/2010/wordprocessingCanvas" xmlns:mc="http://schemas.openxmlformats.org/markup-compatibility/2006" xmlns:o="urn:schemas-microsoft-com:office:office" xmlns:r="http://schemas.openxmlformats.org/officeDocument/2006/relationships" xmlns:m="http://schemas.openxmlformats.org/officeDocument/2006/math" xmlns:v="urn:schemas-microsoft-com:vml" xmlns:wp14="http://schemas.microsoft.com/office/word/2010/wordprocessingDrawing" xmlns:wp="http://schemas.openxmlformats.org/drawingml/2006/wordprocessingDrawing" xmlns:w10="urn:schemas-microsoft-com:office:word" xmlns:w="http://schemas.openxmlformats.org/wordprocessingml/2006/main" xmlns:w14="http://schemas.microsoft.com/office/word/2010/wordml" xmlns:w15="http://schemas.microsoft.com/office/word/2012/wordml" xmlns:wpg="http://schemas.microsoft.com/office/word/2010/wordprocessingGroup" xmlns:wpi="http://schemas.microsoft.com/office/word/2010/wordprocessingInk" xmlns:wne="http://schemas.microsoft.com/office/word/2006/wordml" xmlns:wps="http://schemas.microsoft.com/office/word/2010/wordprocessingShape" mc:Ignorable="w14 w15 wp14">
+<w:ftr xmlns:wpc="http://schemas.microsoft.com/office/word/2010/wordprocessingCanvas" xmlns:cx="http://schemas.microsoft.com/office/drawing/2014/chartex" xmlns:cx1="http://schemas.microsoft.com/office/drawing/2015/9/8/chartex" xmlns:cx2="http://schemas.microsoft.com/office/drawing/2015/10/21/chartex" xmlns:cx3="http://schemas.microsoft.com/office/drawing/2016/5/9/chartex" xmlns:cx4="http://schemas.microsoft.com/office/drawing/2016/5/10/chartex" xmlns:cx5="http://schemas.microsoft.com/office/drawing/2016/5/11/chartex" xmlns:cx6="http://schemas.microsoft.com/office/drawing/2016/5/12/chartex" xmlns:cx7="http://schemas.microsoft.com/office/drawing/2016/5/13/chartex" xmlns:cx8="http://schemas.microsoft.com/office/drawing/2016/5/14/chartex" xmlns:mc="http://schemas.openxmlformats.org/markup-compatibility/2006" xmlns:aink="http://schemas.microsoft.com/office/drawing/2016/ink" xmlns:am3d="http://schemas.microsoft.com/office/drawing/2017/model3d" xmlns:o="urn:schemas-microsoft-com:office:office" xmlns:oel="http://schemas.microsoft.com/office/2019/extlst" xmlns:r="http://schemas.openxmlformats.org/officeDocument/2006/relationships" xmlns:m="http://schemas.openxmlformats.org/officeDocument/2006/math" xmlns:v="urn:schemas-microsoft-com:vml" xmlns:wp14="http://schemas.microsoft.com/office/word/2010/wordprocessingDrawing" xmlns:wp="http://schemas.openxmlformats.org/drawingml/2006/wordprocessingDrawing" xmlns:w10="urn:schemas-microsoft-com:office:word" xmlns:w="http://schemas.openxmlformats.org/wordprocessingml/2006/main" xmlns:w14="http://schemas.microsoft.com/office/word/2010/wordml" xmlns:w15="http://schemas.microsoft.com/office/word/2012/wordml" xmlns:w16cex="http://schemas.microsoft.com/office/word/2018/wordml/cex" xmlns:w16cid="http://schemas.microsoft.com/office/word/2016/wordml/cid" xmlns:w16="http://schemas.microsoft.com/office/word/2018/wordml" xmlns:w16du="http://schemas.microsoft.com/office/word/2023/wordml/word16du" xmlns:w16sdtdh="http://schemas.microsoft.com/office/word/2020/wordml/sdtdatahash" xmlns:w16sdtfl="http://schemas.microsoft.com/office/word/2024/wordml/sdtformatlock" xmlns:w16se="http://schemas.microsoft.com/office/word/2015/wordml/symex" xmlns:wpg="http://schemas.microsoft.com/office/word/2010/wordprocessingGroup" xmlns:wpi="http://schemas.microsoft.com/office/word/2010/wordprocessingInk" xmlns:wne="http://schemas.microsoft.com/office/word/2006/wordml" xmlns:wps="http://schemas.microsoft.com/office/word/2010/wordprocessingShape" mc:Ignorable="w14 w15 w16se w16cid w16 w16cex w16sdtdh w16sdtfl w16du wp14">
   <w:p>
     <w:pPr>
-      <w:pStyle w:val="Pieddepage"/>
+      <w:pStyle w:val="Footer"/>
       <w:rPr>
         <w:sz w:val="16"/>
       </w:rPr>
@@ -402,7 +452,7 @@
 </file>
 
 <file path=word/footnotes.xml><?xml version="1.0" encoding="utf-8"?>
-<w:footnotes xmlns:wpc="http://schemas.microsoft.com/office/word/2010/wordprocessingCanvas" xmlns:mc="http://schemas.openxmlformats.org/markup-compatibility/2006" xmlns:o="urn:schemas-microsoft-com:office:office" xmlns:r="http://schemas.openxmlformats.org/officeDocument/2006/relationships" xmlns:m="http://schemas.openxmlformats.org/officeDocument/2006/math" xmlns:v="urn:schemas-microsoft-com:vml" xmlns:wp14="http://schemas.microsoft.com/office/word/2010/wordprocessingDrawing" xmlns:wp="http://schemas.openxmlformats.org/drawingml/2006/wordprocessingDrawing" xmlns:w10="urn:schemas-microsoft-com:office:word" xmlns:w="http://schemas.openxmlformats.org/wordprocessingml/2006/main" xmlns:w14="http://schemas.microsoft.com/office/word/2010/wordml" xmlns:w15="http://schemas.microsoft.com/office/word/2012/wordml" xmlns:wpg="http://schemas.microsoft.com/office/word/2010/wordprocessingGroup" xmlns:wpi="http://schemas.microsoft.com/office/word/2010/wordprocessingInk" xmlns:wne="http://schemas.microsoft.com/office/word/2006/wordml" xmlns:wps="http://schemas.microsoft.com/office/word/2010/wordprocessingShape" mc:Ignorable="w14 w15 wp14">
+<w:footnotes xmlns:wpc="http://schemas.microsoft.com/office/word/2010/wordprocessingCanvas" xmlns:cx="http://schemas.microsoft.com/office/drawing/2014/chartex" xmlns:cx1="http://schemas.microsoft.com/office/drawing/2015/9/8/chartex" xmlns:cx2="http://schemas.microsoft.com/office/drawing/2015/10/21/chartex" xmlns:cx3="http://schemas.microsoft.com/office/drawing/2016/5/9/chartex" xmlns:cx4="http://schemas.microsoft.com/office/drawing/2016/5/10/chartex" xmlns:cx5="http://schemas.microsoft.com/office/drawing/2016/5/11/chartex" xmlns:cx6="http://schemas.microsoft.com/office/drawing/2016/5/12/chartex" xmlns:cx7="http://schemas.microsoft.com/office/drawing/2016/5/13/chartex" xmlns:cx8="http://schemas.microsoft.com/office/drawing/2016/5/14/chartex" xmlns:mc="http://schemas.openxmlformats.org/markup-compatibility/2006" xmlns:aink="http://schemas.microsoft.com/office/drawing/2016/ink" xmlns:am3d="http://schemas.microsoft.com/office/drawing/2017/model3d" xmlns:o="urn:schemas-microsoft-com:office:office" xmlns:oel="http://schemas.microsoft.com/office/2019/extlst" xmlns:r="http://schemas.openxmlformats.org/officeDocument/2006/relationships" xmlns:m="http://schemas.openxmlformats.org/officeDocument/2006/math" xmlns:v="urn:schemas-microsoft-com:vml" xmlns:wp14="http://schemas.microsoft.com/office/word/2010/wordprocessingDrawing" xmlns:wp="http://schemas.openxmlformats.org/drawingml/2006/wordprocessingDrawing" xmlns:w10="urn:schemas-microsoft-com:office:word" xmlns:w="http://schemas.openxmlformats.org/wordprocessingml/2006/main" xmlns:w14="http://schemas.microsoft.com/office/word/2010/wordml" xmlns:w15="http://schemas.microsoft.com/office/word/2012/wordml" xmlns:w16cex="http://schemas.microsoft.com/office/word/2018/wordml/cex" xmlns:w16cid="http://schemas.microsoft.com/office/word/2016/wordml/cid" xmlns:w16="http://schemas.microsoft.com/office/word/2018/wordml" xmlns:w16du="http://schemas.microsoft.com/office/word/2023/wordml/word16du" xmlns:w16sdtdh="http://schemas.microsoft.com/office/word/2020/wordml/sdtdatahash" xmlns:w16sdtfl="http://schemas.microsoft.com/office/word/2024/wordml/sdtformatlock" xmlns:w16se="http://schemas.microsoft.com/office/word/2015/wordml/symex" xmlns:wpg="http://schemas.microsoft.com/office/word/2010/wordprocessingGroup" xmlns:wpi="http://schemas.microsoft.com/office/word/2010/wordprocessingInk" xmlns:wne="http://schemas.microsoft.com/office/word/2006/wordml" xmlns:wps="http://schemas.microsoft.com/office/word/2010/wordprocessingShape" mc:Ignorable="w14 w15 w16se w16cid w16 w16cex w16sdtdh w16sdtfl w16du wp14">
   <w:footnote w:type="separator" w:id="-1">
     <w:p>
       <w:pPr>
@@ -427,7 +477,7 @@
 </file>
 
 <file path=word/numbering.xml><?xml version="1.0" encoding="utf-8"?>
-<w:numbering xmlns:wpc="http://schemas.microsoft.com/office/word/2010/wordprocessingCanvas" xmlns:mc="http://schemas.openxmlformats.org/markup-compatibility/2006" xmlns:o="urn:schemas-microsoft-com:office:office" xmlns:r="http://schemas.openxmlformats.org/officeDocument/2006/relationships" xmlns:m="http://schemas.openxmlformats.org/officeDocument/2006/math" xmlns:v="urn:schemas-microsoft-com:vml" xmlns:wp14="http://schemas.microsoft.com/office/word/2010/wordprocessingDrawing" xmlns:wp="http://schemas.openxmlformats.org/drawingml/2006/wordprocessingDrawing" xmlns:w10="urn:schemas-microsoft-com:office:word" xmlns:w="http://schemas.openxmlformats.org/wordprocessingml/2006/main" xmlns:w14="http://schemas.microsoft.com/office/word/2010/wordml" xmlns:w15="http://schemas.microsoft.com/office/word/2012/wordml" xmlns:wpg="http://schemas.microsoft.com/office/word/2010/wordprocessingGroup" xmlns:wpi="http://schemas.microsoft.com/office/word/2010/wordprocessingInk" xmlns:wne="http://schemas.microsoft.com/office/word/2006/wordml" xmlns:wps="http://schemas.microsoft.com/office/word/2010/wordprocessingShape" mc:Ignorable="w14 w15 wp14">
+<w:numbering xmlns:wpc="http://schemas.microsoft.com/office/word/2010/wordprocessingCanvas" xmlns:cx="http://schemas.microsoft.com/office/drawing/2014/chartex" xmlns:cx1="http://schemas.microsoft.com/office/drawing/2015/9/8/chartex" xmlns:cx2="http://schemas.microsoft.com/office/drawing/2015/10/21/chartex" xmlns:cx3="http://schemas.microsoft.com/office/drawing/2016/5/9/chartex" xmlns:cx4="http://schemas.microsoft.com/office/drawing/2016/5/10/chartex" xmlns:cx5="http://schemas.microsoft.com/office/drawing/2016/5/11/chartex" xmlns:cx6="http://schemas.microsoft.com/office/drawing/2016/5/12/chartex" xmlns:cx7="http://schemas.microsoft.com/office/drawing/2016/5/13/chartex" xmlns:cx8="http://schemas.microsoft.com/office/drawing/2016/5/14/chartex" xmlns:mc="http://schemas.openxmlformats.org/markup-compatibility/2006" xmlns:aink="http://schemas.microsoft.com/office/drawing/2016/ink" xmlns:am3d="http://schemas.microsoft.com/office/drawing/2017/model3d" xmlns:o="urn:schemas-microsoft-com:office:office" xmlns:oel="http://schemas.microsoft.com/office/2019/extlst" xmlns:r="http://schemas.openxmlformats.org/officeDocument/2006/relationships" xmlns:m="http://schemas.openxmlformats.org/officeDocument/2006/math" xmlns:v="urn:schemas-microsoft-com:vml" xmlns:wp14="http://schemas.microsoft.com/office/word/2010/wordprocessingDrawing" xmlns:wp="http://schemas.openxmlformats.org/drawingml/2006/wordprocessingDrawing" xmlns:w10="urn:schemas-microsoft-com:office:word" xmlns:w="http://schemas.openxmlformats.org/wordprocessingml/2006/main" xmlns:w14="http://schemas.microsoft.com/office/word/2010/wordml" xmlns:w15="http://schemas.microsoft.com/office/word/2012/wordml" xmlns:w16cex="http://schemas.microsoft.com/office/word/2018/wordml/cex" xmlns:w16cid="http://schemas.microsoft.com/office/word/2016/wordml/cid" xmlns:w16="http://schemas.microsoft.com/office/word/2018/wordml" xmlns:w16du="http://schemas.microsoft.com/office/word/2023/wordml/word16du" xmlns:w16sdtdh="http://schemas.microsoft.com/office/word/2020/wordml/sdtdatahash" xmlns:w16sdtfl="http://schemas.microsoft.com/office/word/2024/wordml/sdtformatlock" xmlns:w16se="http://schemas.microsoft.com/office/word/2015/wordml/symex" xmlns:wpg="http://schemas.microsoft.com/office/word/2010/wordprocessingGroup" xmlns:wpi="http://schemas.microsoft.com/office/word/2010/wordprocessingInk" xmlns:wne="http://schemas.microsoft.com/office/word/2006/wordml" xmlns:wps="http://schemas.microsoft.com/office/word/2010/wordprocessingShape" mc:Ignorable="w14 w15 w16se w16cid w16 w16cex w16sdtdh w16sdtfl w16du wp14">
   <w:abstractNum w:abstractNumId="0" w15:restartNumberingAfterBreak="0">
     <w:nsid w:val="3E476F7F"/>
     <w:multiLevelType w:val="hybridMultilevel"/>
@@ -517,14 +567,14 @@
       </w:pPr>
     </w:lvl>
   </w:abstractNum>
-  <w:num w:numId="1">
+  <w:num w:numId="1" w16cid:durableId="988678432">
     <w:abstractNumId w:val="0"/>
   </w:num>
 </w:numbering>
 </file>
 
 <file path=word/styles.xml><?xml version="1.0" encoding="utf-8"?>
-<w:styles xmlns:mc="http://schemas.openxmlformats.org/markup-compatibility/2006" xmlns:r="http://schemas.openxmlformats.org/officeDocument/2006/relationships" xmlns:w="http://schemas.openxmlformats.org/wordprocessingml/2006/main" xmlns:w14="http://schemas.microsoft.com/office/word/2010/wordml" xmlns:w15="http://schemas.microsoft.com/office/word/2012/wordml" mc:Ignorable="w14 w15">
+<w:styles xmlns:mc="http://schemas.openxmlformats.org/markup-compatibility/2006" xmlns:r="http://schemas.openxmlformats.org/officeDocument/2006/relationships" xmlns:w="http://schemas.openxmlformats.org/wordprocessingml/2006/main" xmlns:w14="http://schemas.microsoft.com/office/word/2010/wordml" xmlns:w15="http://schemas.microsoft.com/office/word/2012/wordml" xmlns:w16cex="http://schemas.microsoft.com/office/word/2018/wordml/cex" xmlns:w16cid="http://schemas.microsoft.com/office/word/2016/wordml/cid" xmlns:w16="http://schemas.microsoft.com/office/word/2018/wordml" xmlns:w16du="http://schemas.microsoft.com/office/word/2023/wordml/word16du" xmlns:w16sdtdh="http://schemas.microsoft.com/office/word/2020/wordml/sdtdatahash" xmlns:w16sdtfl="http://schemas.microsoft.com/office/word/2024/wordml/sdtformatlock" xmlns:w16se="http://schemas.microsoft.com/office/word/2015/wordml/symex" mc:Ignorable="w14 w15 w16se w16cid w16 w16cex w16sdtdh w16sdtfl w16du">
   <w:docDefaults>
     <w:rPrDefault>
       <w:rPr>
@@ -540,7 +590,7 @@
       </w:pPr>
     </w:pPrDefault>
   </w:docDefaults>
-  <w:latentStyles w:defLockedState="0" w:defUIPriority="99" w:defSemiHidden="0" w:defUnhideWhenUsed="0" w:defQFormat="0" w:count="371">
+  <w:latentStyles w:defLockedState="0" w:defUIPriority="99" w:defSemiHidden="0" w:defUnhideWhenUsed="0" w:defQFormat="0" w:count="376">
     <w:lsdException w:name="Normal" w:uiPriority="0" w:qFormat="1"/>
     <w:lsdException w:name="heading 1" w:uiPriority="9" w:qFormat="1"/>
     <w:lsdException w:name="heading 2" w:semiHidden="1" w:uiPriority="9" w:unhideWhenUsed="1" w:qFormat="1"/>
@@ -912,16 +962,21 @@
     <w:lsdException w:name="List Table 5 Dark Accent 6" w:uiPriority="50"/>
     <w:lsdException w:name="List Table 6 Colorful Accent 6" w:uiPriority="51"/>
     <w:lsdException w:name="List Table 7 Colorful Accent 6" w:uiPriority="52"/>
+    <w:lsdException w:name="Mention" w:semiHidden="1" w:unhideWhenUsed="1"/>
+    <w:lsdException w:name="Smart Hyperlink" w:semiHidden="1" w:unhideWhenUsed="1"/>
+    <w:lsdException w:name="Hashtag" w:semiHidden="1" w:unhideWhenUsed="1"/>
+    <w:lsdException w:name="Unresolved Mention" w:semiHidden="1" w:unhideWhenUsed="1"/>
+    <w:lsdException w:name="Smart Link" w:semiHidden="1" w:unhideWhenUsed="1"/>
   </w:latentStyles>
   <w:style w:type="paragraph" w:default="1" w:styleId="Normal">
     <w:name w:val="Normal"/>
     <w:qFormat/>
   </w:style>
-  <w:style w:type="paragraph" w:styleId="Titre1">
+  <w:style w:type="paragraph" w:styleId="Heading1">
     <w:name w:val="heading 1"/>
     <w:basedOn w:val="Normal"/>
     <w:next w:val="Normal"/>
-    <w:link w:val="Titre1Car"/>
+    <w:link w:val="Heading1Char"/>
     <w:uiPriority w:val="9"/>
     <w:qFormat/>
     <w:rsid w:val="00773864"/>
@@ -938,13 +993,13 @@
       <w:szCs w:val="32"/>
     </w:rPr>
   </w:style>
-  <w:style w:type="character" w:default="1" w:styleId="Policepardfaut">
+  <w:style w:type="character" w:default="1" w:styleId="DefaultParagraphFont">
     <w:name w:val="Default Paragraph Font"/>
     <w:uiPriority w:val="1"/>
     <w:semiHidden/>
     <w:unhideWhenUsed/>
   </w:style>
-  <w:style w:type="table" w:default="1" w:styleId="TableauNormal">
+  <w:style w:type="table" w:default="1" w:styleId="TableNormal">
     <w:name w:val="Normal Table"/>
     <w:uiPriority w:val="99"/>
     <w:semiHidden/>
@@ -959,13 +1014,13 @@
       </w:tblCellMar>
     </w:tblPr>
   </w:style>
-  <w:style w:type="numbering" w:default="1" w:styleId="Aucuneliste">
+  <w:style w:type="numbering" w:default="1" w:styleId="NoList">
     <w:name w:val="No List"/>
     <w:uiPriority w:val="99"/>
     <w:semiHidden/>
     <w:unhideWhenUsed/>
   </w:style>
-  <w:style w:type="paragraph" w:styleId="Paragraphedeliste">
+  <w:style w:type="paragraph" w:styleId="ListParagraph">
     <w:name w:val="List Paragraph"/>
     <w:basedOn w:val="Normal"/>
     <w:uiPriority w:val="34"/>
@@ -976,10 +1031,10 @@
       <w:contextualSpacing/>
     </w:pPr>
   </w:style>
-  <w:style w:type="character" w:customStyle="1" w:styleId="Titre1Car">
-    <w:name w:val="Titre 1 Car"/>
-    <w:basedOn w:val="Policepardfaut"/>
-    <w:link w:val="Titre1"/>
+  <w:style w:type="character" w:customStyle="1" w:styleId="Heading1Char">
+    <w:name w:val="Heading 1 Char"/>
+    <w:basedOn w:val="DefaultParagraphFont"/>
+    <w:link w:val="Heading1"/>
     <w:uiPriority w:val="9"/>
     <w:rsid w:val="00773864"/>
     <w:rPr>
@@ -989,11 +1044,11 @@
       <w:szCs w:val="32"/>
     </w:rPr>
   </w:style>
-  <w:style w:type="paragraph" w:styleId="Titre">
+  <w:style w:type="paragraph" w:styleId="Title">
     <w:name w:val="Title"/>
     <w:basedOn w:val="Normal"/>
     <w:next w:val="Normal"/>
-    <w:link w:val="TitreCar"/>
+    <w:link w:val="TitleChar"/>
     <w:uiPriority w:val="10"/>
     <w:qFormat/>
     <w:rsid w:val="00891FFE"/>
@@ -1009,10 +1064,10 @@
       <w:szCs w:val="56"/>
     </w:rPr>
   </w:style>
-  <w:style w:type="character" w:customStyle="1" w:styleId="TitreCar">
-    <w:name w:val="Titre Car"/>
-    <w:basedOn w:val="Policepardfaut"/>
-    <w:link w:val="Titre"/>
+  <w:style w:type="character" w:customStyle="1" w:styleId="TitleChar">
+    <w:name w:val="Title Char"/>
+    <w:basedOn w:val="DefaultParagraphFont"/>
+    <w:link w:val="Title"/>
     <w:uiPriority w:val="10"/>
     <w:rsid w:val="00891FFE"/>
     <w:rPr>
@@ -1023,11 +1078,11 @@
       <w:szCs w:val="56"/>
     </w:rPr>
   </w:style>
-  <w:style w:type="paragraph" w:styleId="Sous-titre">
+  <w:style w:type="paragraph" w:styleId="Subtitle">
     <w:name w:val="Subtitle"/>
     <w:basedOn w:val="Normal"/>
     <w:next w:val="Normal"/>
-    <w:link w:val="Sous-titreCar"/>
+    <w:link w:val="SubtitleChar"/>
     <w:uiPriority w:val="11"/>
     <w:qFormat/>
     <w:rsid w:val="00773864"/>
@@ -1043,10 +1098,10 @@
       <w:spacing w:val="15"/>
     </w:rPr>
   </w:style>
-  <w:style w:type="character" w:customStyle="1" w:styleId="Sous-titreCar">
-    <w:name w:val="Sous-titre Car"/>
-    <w:basedOn w:val="Policepardfaut"/>
-    <w:link w:val="Sous-titre"/>
+  <w:style w:type="character" w:customStyle="1" w:styleId="SubtitleChar">
+    <w:name w:val="Subtitle Char"/>
+    <w:basedOn w:val="DefaultParagraphFont"/>
+    <w:link w:val="Subtitle"/>
     <w:uiPriority w:val="11"/>
     <w:rsid w:val="00773864"/>
     <w:rPr>
@@ -1056,10 +1111,10 @@
       <w:spacing w:val="15"/>
     </w:rPr>
   </w:style>
-  <w:style w:type="paragraph" w:styleId="En-tte">
+  <w:style w:type="paragraph" w:styleId="Header">
     <w:name w:val="header"/>
     <w:basedOn w:val="Normal"/>
-    <w:link w:val="En-tteCar"/>
+    <w:link w:val="HeaderChar"/>
     <w:uiPriority w:val="99"/>
     <w:unhideWhenUsed/>
     <w:rsid w:val="0047093C"/>
@@ -1071,17 +1126,17 @@
       <w:spacing w:after="0" w:line="240" w:lineRule="auto"/>
     </w:pPr>
   </w:style>
-  <w:style w:type="character" w:customStyle="1" w:styleId="En-tteCar">
-    <w:name w:val="En-tête Car"/>
-    <w:basedOn w:val="Policepardfaut"/>
-    <w:link w:val="En-tte"/>
+  <w:style w:type="character" w:customStyle="1" w:styleId="HeaderChar">
+    <w:name w:val="Header Char"/>
+    <w:basedOn w:val="DefaultParagraphFont"/>
+    <w:link w:val="Header"/>
     <w:uiPriority w:val="99"/>
     <w:rsid w:val="0047093C"/>
   </w:style>
-  <w:style w:type="paragraph" w:styleId="Pieddepage">
+  <w:style w:type="paragraph" w:styleId="Footer">
     <w:name w:val="footer"/>
     <w:basedOn w:val="Normal"/>
-    <w:link w:val="PieddepageCar"/>
+    <w:link w:val="FooterChar"/>
     <w:uiPriority w:val="99"/>
     <w:unhideWhenUsed/>
     <w:rsid w:val="0047093C"/>
@@ -1093,10 +1148,10 @@
       <w:spacing w:after="0" w:line="240" w:lineRule="auto"/>
     </w:pPr>
   </w:style>
-  <w:style w:type="character" w:customStyle="1" w:styleId="PieddepageCar">
-    <w:name w:val="Pied de page Car"/>
-    <w:basedOn w:val="Policepardfaut"/>
-    <w:link w:val="Pieddepage"/>
+  <w:style w:type="character" w:customStyle="1" w:styleId="FooterChar">
+    <w:name w:val="Footer Char"/>
+    <w:basedOn w:val="DefaultParagraphFont"/>
+    <w:link w:val="Footer"/>
     <w:uiPriority w:val="99"/>
     <w:rsid w:val="0047093C"/>
   </w:style>

</xml_diff>